<commit_message>
Schools and Clinics: preview copy on the new site stylesheet, hero opens the narrated guided demo; brief updated for Claude Design with the form code note
Co-Authored-By: Claude Fable 5.1 <noreply@anthropic.com>
Claude-Session: https://claude.ai/code/session_01FdLL4Wp3bi12KNX6zHRo7N
</commit_message>
<xml_diff>
--- a/EZvoxa Schools and Clinics Section Brief.docx
+++ b/EZvoxa Schools and Clinics Section Brief.docx
@@ -28,7 +28,7 @@
           <w:sz w:val="22"/>
           <w:szCs w:val="22"/>
         </w:rPr>
-        <w:t xml:space="preserve">9 September 2026. Prepared for Frank Schaeffer to hand to Claude Design. The section is already built as working code; this brief tells the designer what it is, where it is, and what may and may not change.</w:t>
+        <w:t xml:space="preserve">10 September 2026. Prepared for Frank Schaeffer to hand to Claude Design. The section is already built as working code; this brief tells the designer what it is, where it is, and what may and may not change.</w:t>
       </w:r>
     </w:p>
     <w:p>
@@ -96,7 +96,7 @@
           <w:sz w:val="22"/>
           <w:szCs w:val="22"/>
         </w:rPr>
-        <w:t xml:space="preserve">Repository fschaeffer16/EZvoxaWEBSITE, branch schools-section. Files: schools.html (the page), schools-poster.jpg (the video poster), site.js (two additions, see section 8).</w:t>
+        <w:t xml:space="preserve">Repository fschaeffer16/EZvoxaWEBSITE, branch schools-section, rebuilt on top of the 9 September site upload so it merges cleanly. Files: schools.html (the page) and schools-poster.jpg (the hero poster). Nothing else on the site is touched by the branch.</w:t>
       </w:r>
     </w:p>
     <w:p>
@@ -322,7 +322,7 @@
           <w:sz w:val="22"/>
           <w:szCs w:val="22"/>
         </w:rPr>
-        <w:t xml:space="preserve">The video slot is 16:9 and plays pro-demo.mp4 when that file is placed in the site’s root. Until then the poster (a School board screen on navy) shows with a play badge that links to the guided demo. Frank has recorded the narration; the finished file goes in as pro-demo.mp4 and nothing else changes.</w:t>
+        <w:t xml:space="preserve">The narrated demo already on the site is guided-demo.html with demo-narration.mp3 (4:45), not a video file, so the hero slot is a 16:9 poster (a School board screen on navy) with a play badge that opens that page. If a video file is ever produced, the poster becomes its poster frame and nothing else moves.</w:t>
       </w:r>
     </w:p>
     <w:p>
@@ -1634,7 +1634,7 @@
           <w:sz w:val="22"/>
           <w:szCs w:val="22"/>
         </w:rPr>
-        <w:t xml:space="preserve">The page posts JSON to api/quote on our Vercel project. The server checks the origin (ezvoxa.com, www, app.ezvoxa.com, ez-comm-tether.vercel.app), rejects a filled honeypot, requires organization, contact name, state and a valid email, and allows five requests per address per hour.</w:t>
+        <w:t xml:space="preserve">The page posts JSON to /app/api/quote, which the site’s vercel.json already rewrites to api/quote on our Vercel project. The server checks the origin (ezvoxa.com, www, app.ezvoxa.com, ez-comm-tether.vercel.app), rejects a filled honeypot, requires organization, contact name, state and a valid email, and allows five requests per address per hour.</w:t>
       </w:r>
     </w:p>
     <w:p>
@@ -1682,7 +1682,7 @@
         <w:rPr>
           <w:rFonts w:ascii="Calibri" w:cs="Calibri" w:eastAsia="Calibri" w:hAnsi="Calibri"/>
         </w:rPr>
-        <w:t xml:space="preserve">8. Two site forms that were not sending</w:t>
+        <w:t xml:space="preserve">8. Form code that has to live in Claude Design’s source</w:t>
       </w:r>
     </w:p>
     <w:p>
@@ -1695,7 +1695,20 @@
           <w:sz w:val="22"/>
           <w:szCs w:val="22"/>
         </w:rPr>
-        <w:t xml:space="preserve">While building this, I found that the existing forms on join.html (free registration) and professionals.html (professional inquiry) have no code behind them on the live site: site.js only handles the menu and the demo pictures, so pressing the button reloads the page and the entry is lost. The server endpoints for both exist and answer. The branch adds the missing code to site.js: the registration form posts to /app/api/waitlist and the inquiry form to /app/api/professional-inquiry, both same-origin through the site’s existing /app rewrite, and both show a plain status line. Nothing else in site.js changed.</w:t>
+        <w:t xml:space="preserve">The forms on join.html (free registration) and professionals.html (professional inquiry) had no code behind them on the live site: site.js only handled the menu and the demo pictures, so pressing the button reloaded the page and the entry was lost. I added the code to site.js on 9 September; the site upload later that day replaced site.js and removed it; I put it back. It will be removed again by every export unless it is in Claude Design’s own copy of site.js.</w:t>
+      </w:r>
+    </w:p>
+    <w:p>
+      <w:pPr>
+        <w:spacing w:after="120"/>
+      </w:pPr>
+      <w:r>
+        <w:rPr>
+          <w:rFonts w:ascii="Calibri" w:cs="Calibri" w:eastAsia="Calibri" w:hAnsi="Calibri"/>
+          <w:sz w:val="22"/>
+          <w:szCs w:val="22"/>
+        </w:rPr>
+        <w:t xml:space="preserve">So: the block in forms-snippet.txt at the root of the site repository is to be appended to site.js in Claude Design’s source, verbatim. It wires [data-signup-form] to /app/api/waitlist and [data-prof-form] to /app/api/professional-inquiry, same-origin through the site’s existing /app rewrite, and writes a plain status line into each form’s [data-status] element. No other change to site.js is needed. The same rule applies to schools.html: once it is in Claude Design’s source, exports will carry it.</w:t>
       </w:r>
     </w:p>
     <w:p>
@@ -1743,7 +1756,7 @@
           <w:sz w:val="22"/>
           <w:szCs w:val="22"/>
         </w:rPr>
-        <w:t xml:space="preserve">The narrated demo file, saved as pro-demo.mp4 in the site’s root.</w:t>
+        <w:t xml:space="preserve">Whether the hero should open the guided demo page, as built, or a video file when one exists.</w:t>
       </w:r>
     </w:p>
     <w:p>
@@ -1815,7 +1828,7 @@
           <w:sz w:val="22"/>
           <w:szCs w:val="22"/>
         </w:rPr>
-        <w:t xml:space="preserve">Merge of the schools-section branch into the website’s main once he has reviewed the preview on all three screen sizes.</w:t>
+        <w:t xml:space="preserve">Merge of the schools-section branch into the website’s main once he has reviewed the preview on all three screen sizes, or hand schools.html and forms-snippet.txt to Claude Design and let the next export carry them.</w:t>
       </w:r>
     </w:p>
     <w:sectPr>

</xml_diff>